<commit_message>
docs(runbook): warn before destructive restore and migrate --record
Review findings: the mongorestore --drop step had no guard (confirm target,
dump it first, stop worker and beat), migrate --record had no warning in the
shared procedure, and the method-override backend branch was described as
published in udata-pt when it never was.

Refs: LEDG-2569
</commit_message>
<xml_diff>
--- a/docs/manual-incidentes-dadosgov.docx
+++ b/docs/manual-incidentes-dadosgov.docx
@@ -3329,6 +3329,40 @@
         <w:pStyle w:val="ListBullet"/>
       </w:pPr>
       <w:r>
+        <w:rPr>
+          <w:b/>
+        </w:rPr>
+        <w:t>Atenção:</w:t>
+      </w:r>
+      <w:r>
+        <w:t xml:space="preserve"> </w:t>
+      </w:r>
+      <w:r>
+        <w:rPr>
+          <w:rFonts w:ascii="Consolas" w:hAnsi="Consolas"/>
+          <w:color w:val="C03421"/>
+        </w:rPr>
+        <w:t>udata db migrate --record</w:t>
+      </w:r>
+      <w:r>
+        <w:t xml:space="preserve"> marca como aplicadas migrações que não correram, e esconde assim alterações de esquema e de dados que ficam por fazer. Só se usa para reproduzir um histórico de migrações que se sabe já aplicado, como na sequência pós-restauro do capítulo 8. Um registo feito por engano só se desfaz com </w:t>
+      </w:r>
+      <w:r>
+        <w:rPr>
+          <w:rFonts w:ascii="Consolas" w:hAnsi="Consolas"/>
+          <w:color w:val="C03421"/>
+        </w:rPr>
+        <w:t>udata db unrecord</w:t>
+      </w:r>
+      <w:r>
+        <w:t>, um ficheiro de cada vez.</w:t>
+      </w:r>
+    </w:p>
+    <w:p>
+      <w:pPr>
+        <w:pStyle w:val="ListBullet"/>
+      </w:pPr>
+      <w:r>
         <w:t xml:space="preserve">O comando é </w:t>
       </w:r>
       <w:r>
@@ -9933,7 +9967,93 @@
         <w:rPr>
           <w:b/>
         </w:rPr>
-        <w:t>Restauro:</w:t>
+        <w:t>Restauro.</w:t>
+      </w:r>
+      <w:r>
+        <w:t xml:space="preserve"> </w:t>
+      </w:r>
+      <w:r>
+        <w:rPr>
+          <w:b/>
+        </w:rPr>
+        <w:t>Atenção:</w:t>
+      </w:r>
+      <w:r>
+        <w:t xml:space="preserve"> </w:t>
+      </w:r>
+      <w:r>
+        <w:rPr>
+          <w:rFonts w:ascii="Consolas" w:hAnsi="Consolas"/>
+          <w:color w:val="C03421"/>
+        </w:rPr>
+        <w:t>--drop</w:t>
+      </w:r>
+      <w:r>
+        <w:t xml:space="preserve"> apaga cada coleção da base de destino antes de a carregar, e o que lá estava perde-se. Antes de correr:</w:t>
+      </w:r>
+    </w:p>
+    <w:p>
+      <w:pPr>
+        <w:pStyle w:val="ListParagraph"/>
+      </w:pPr>
+      <w:r>
+        <w:t xml:space="preserve">1. Confirmar o </w:t>
+      </w:r>
+      <w:r>
+        <w:rPr>
+          <w:rFonts w:ascii="Consolas" w:hAnsi="Consolas"/>
+          <w:color w:val="C03421"/>
+        </w:rPr>
+        <w:t>&lt;SERVER_MONGO&gt;</w:t>
+      </w:r>
+      <w:r>
+        <w:t xml:space="preserve"> e o ambiente de destino com um segundo elemento da equipa.</w:t>
+      </w:r>
+    </w:p>
+    <w:p>
+      <w:pPr>
+        <w:pStyle w:val="ListParagraph"/>
+      </w:pPr>
+      <w:r>
+        <w:t>2. Fazer um dump do estado atual do destino (comando de backup acima), mesmo que esteja danificado, para poder voltar atrás.</w:t>
+      </w:r>
+    </w:p>
+    <w:p>
+      <w:pPr>
+        <w:pStyle w:val="ListParagraph"/>
+      </w:pPr>
+      <w:r>
+        <w:t xml:space="preserve">3. Parar </w:t>
+      </w:r>
+      <w:r>
+        <w:rPr>
+          <w:rFonts w:ascii="Consolas" w:hAnsi="Consolas"/>
+          <w:color w:val="C03421"/>
+        </w:rPr>
+        <w:t>worker</w:t>
+      </w:r>
+      <w:r>
+        <w:t xml:space="preserve"> e </w:t>
+      </w:r>
+      <w:r>
+        <w:rPr>
+          <w:rFonts w:ascii="Consolas" w:hAnsi="Consolas"/>
+          <w:color w:val="C03421"/>
+        </w:rPr>
+        <w:t>beat</w:t>
+      </w:r>
+      <w:r>
+        <w:t xml:space="preserve"> (</w:t>
+      </w:r>
+      <w:r>
+        <w:rPr>
+          <w:rFonts w:ascii="Consolas" w:hAnsi="Consolas"/>
+          <w:color w:val="C03421"/>
+        </w:rPr>
+        <w:t>docker compose stop worker beat</w:t>
+      </w:r>
+      <w:r>
+        <w:t>), para nada escrever na base durante o restauro.</w:t>
       </w:r>
     </w:p>
     <w:p>
@@ -9966,7 +10086,37 @@
         <w:t>FieldDoesNotExist</w:t>
       </w:r>
       <w:r>
-        <w:t>) e da verificação dos agendamentos (PC-5).</w:t>
+        <w:t xml:space="preserve">) e da verificação dos agendamentos (PC-5). No fim, voltar a arrancar </w:t>
+      </w:r>
+      <w:r>
+        <w:rPr>
+          <w:rFonts w:ascii="Consolas" w:hAnsi="Consolas"/>
+          <w:color w:val="C03421"/>
+        </w:rPr>
+        <w:t>worker</w:t>
+      </w:r>
+      <w:r>
+        <w:t xml:space="preserve"> e </w:t>
+      </w:r>
+      <w:r>
+        <w:rPr>
+          <w:rFonts w:ascii="Consolas" w:hAnsi="Consolas"/>
+          <w:color w:val="C03421"/>
+        </w:rPr>
+        <w:t>beat</w:t>
+      </w:r>
+      <w:r>
+        <w:t xml:space="preserve"> (</w:t>
+      </w:r>
+      <w:r>
+        <w:rPr>
+          <w:rFonts w:ascii="Consolas" w:hAnsi="Consolas"/>
+          <w:color w:val="C03421"/>
+        </w:rPr>
+        <w:t>docker compose start worker beat</w:t>
+      </w:r>
+      <w:r>
+        <w:t>).</w:t>
       </w:r>
     </w:p>
     <w:p>
@@ -12943,7 +13093,16 @@
         <w:t>NEXT_PUBLIC_USE_METHOD_OVERRIDE=true</w:t>
       </w:r>
       <w:r>
-        <w:t xml:space="preserve">. Está desenvolvida nas branches </w:t>
+        <w:t xml:space="preserve">. </w:t>
+      </w:r>
+      <w:r>
+        <w:rPr>
+          <w:b/>
+        </w:rPr>
+        <w:t>Não está integrada em `develop` de nenhum dos repositórios</w:t>
+      </w:r>
+      <w:r>
+        <w:t xml:space="preserve"> (verificado a 2026-09-29): o lado do frontend está na branch </w:t>
       </w:r>
       <w:r>
         <w:rPr>
@@ -12953,16 +13112,27 @@
         <w:t>feat/http-method-override</w:t>
       </w:r>
       <w:r>
-        <w:t xml:space="preserve"> dos dois repositórios, </w:t>
-      </w:r>
-      <w:r>
-        <w:rPr>
-          <w:b/>
-        </w:rPr>
-        <w:t>mas não está integrada em `develop`</w:t>
-      </w:r>
-      <w:r>
-        <w:t xml:space="preserve"> (verificado a 2026-09-29); avaliação em </w:t>
+        <w:t xml:space="preserve"> de </w:t>
+      </w:r>
+      <w:r>
+        <w:rPr>
+          <w:rFonts w:ascii="Consolas" w:hAnsi="Consolas"/>
+          <w:color w:val="C03421"/>
+        </w:rPr>
+        <w:t>amagovpt/dadosgov-fe</w:t>
+      </w:r>
+      <w:r>
+        <w:t xml:space="preserve">, e o middleware do backend nunca foi publicado em </w:t>
+      </w:r>
+      <w:r>
+        <w:rPr>
+          <w:rFonts w:ascii="Consolas" w:hAnsi="Consolas"/>
+          <w:color w:val="C03421"/>
+        </w:rPr>
+        <w:t>amagovpt/udata-pt</w:t>
+      </w:r>
+      <w:r>
+        <w:t xml:space="preserve">, pelo que ainda não há uma versão completa que se possa testar. Avaliação em </w:t>
       </w:r>
       <w:r>
         <w:rPr>
@@ -16999,6 +17169,9 @@
                 <w:color w:val="C03421"/>
               </w:rPr>
               <w:t>feat/http-method-override</w:t>
+            </w:r>
+            <w:r>
+              <w:t xml:space="preserve"> do frontend</w:t>
             </w:r>
           </w:p>
         </w:tc>

</xml_diff>